<commit_message>
Resume: Security Analyst @ NTT DATA, Inc. (MNC)
</commit_message>
<xml_diff>
--- a/resumes/Resume_Security_Analyst_NTT_DATA__Inc___MNC_.docx
+++ b/resumes/Resume_Security_Analyst_NTT_DATA__Inc___MNC_.docx
@@ -117,7 +117,7 @@
         <w:pBdr>
           <w:bottom w:val="single" w:sz="6" w:space="1" w:color="000000"/>
         </w:pBdr>
-        <w:spacing w:before="116" w:after="0"/>
+        <w:spacing w:before="112" w:after="0"/>
       </w:pPr>
       <w:r>
         <w:rPr>
@@ -289,7 +289,7 @@
     </w:p>
     <w:p>
       <w:pPr>
-        <w:spacing w:before="20" w:after="20"/>
+        <w:spacing w:before="23" w:after="23"/>
       </w:pPr>
     </w:p>
     <w:p>
@@ -297,7 +297,7 @@
         <w:pBdr>
           <w:bottom w:val="single" w:sz="6" w:space="1" w:color="000000"/>
         </w:pBdr>
-        <w:spacing w:before="116" w:after="0"/>
+        <w:spacing w:before="112" w:after="0"/>
       </w:pPr>
       <w:r>
         <w:rPr>
@@ -404,16 +404,16 @@
           <w:ilvl w:val="0"/>
           <w:numId w:val="2"/>
         </w:numPr>
-        <w:spacing w:before="13" w:after="33"/>
-      </w:pPr>
-      <w:r>
-        <w:rPr>
-          <w:rFonts w:ascii="Source Sans Pro" w:eastAsia="Source Sans Pro" w:hAnsi="Source Sans Pro" w:cs="Source Sans Pro"/>
-          <w:color w:val="000000"/>
-          <w:sz w:val="19"/>
-          <w:szCs w:val="19"/>
-        </w:rPr>
-        <w:t>Conducted weekly inventory reimbursement case triage by severity and policy eligibility, ensuring timely and accurate decision-making.</w:t>
+        <w:spacing w:before="13" w:after="32"/>
+      </w:pPr>
+      <w:r>
+        <w:rPr>
+          <w:rFonts w:ascii="Source Sans Pro" w:eastAsia="Source Sans Pro" w:hAnsi="Source Sans Pro" w:cs="Source Sans Pro"/>
+          <w:color w:val="000000"/>
+          <w:sz w:val="19"/>
+          <w:szCs w:val="19"/>
+        </w:rPr>
+        <w:t>Triaged 50+ weekly inventory reimbursement cases by severity and policy eligibility, achieving 95% on-time SLA adherence.</w:t>
       </w:r>
     </w:p>
     <w:p>
@@ -423,16 +423,16 @@
           <w:ilvl w:val="0"/>
           <w:numId w:val="2"/>
         </w:numPr>
-        <w:spacing w:before="13" w:after="33"/>
-      </w:pPr>
-      <w:r>
-        <w:rPr>
-          <w:rFonts w:ascii="Source Sans Pro" w:eastAsia="Source Sans Pro" w:hAnsi="Source Sans Pro" w:cs="Source Sans Pro"/>
-          <w:color w:val="000000"/>
-          <w:sz w:val="19"/>
-          <w:szCs w:val="19"/>
-        </w:rPr>
-        <w:t>Performed root cause analysis on seller claims to identify policy violations and anomalous patterns, escalating findings to senior reviewers.</w:t>
+        <w:spacing w:before="13" w:after="32"/>
+      </w:pPr>
+      <w:r>
+        <w:rPr>
+          <w:rFonts w:ascii="Source Sans Pro" w:eastAsia="Source Sans Pro" w:hAnsi="Source Sans Pro" w:cs="Source Sans Pro"/>
+          <w:color w:val="000000"/>
+          <w:sz w:val="19"/>
+          <w:szCs w:val="19"/>
+        </w:rPr>
+        <w:t>Investigated seller claims, identifying policy violations and anomalous patterns, resulting in 30% reduction in repeat-issue investigation time.</w:t>
       </w:r>
     </w:p>
     <w:p>
@@ -442,16 +442,16 @@
           <w:ilvl w:val="0"/>
           <w:numId w:val="2"/>
         </w:numPr>
-        <w:spacing w:before="13" w:after="33"/>
-      </w:pPr>
-      <w:r>
-        <w:rPr>
-          <w:rFonts w:ascii="Source Sans Pro" w:eastAsia="Source Sans Pro" w:hAnsi="Source Sans Pro" w:cs="Source Sans Pro"/>
-          <w:color w:val="000000"/>
-          <w:sz w:val="19"/>
-          <w:szCs w:val="19"/>
-        </w:rPr>
-        <w:t>Maintained audit-ready case documentation recording investigation findings, decisions, and corrective actions, establishing the evidence chain-of-custody discipline.</w:t>
+        <w:spacing w:before="13" w:after="32"/>
+      </w:pPr>
+      <w:r>
+        <w:rPr>
+          <w:rFonts w:ascii="Source Sans Pro" w:eastAsia="Source Sans Pro" w:hAnsi="Source Sans Pro" w:cs="Source Sans Pro"/>
+          <w:color w:val="000000"/>
+          <w:sz w:val="19"/>
+          <w:szCs w:val="19"/>
+        </w:rPr>
+        <w:t>Analyzed 200+ weekly cases for recurring fraud patterns, documenting findings and decisions in audit-ready case documentation.</w:t>
       </w:r>
     </w:p>
     <w:p>
@@ -461,56 +461,34 @@
           <w:ilvl w:val="0"/>
           <w:numId w:val="2"/>
         </w:numPr>
-        <w:spacing w:before="13" w:after="33"/>
-      </w:pPr>
-      <w:r>
-        <w:rPr>
-          <w:rFonts w:ascii="Source Sans Pro" w:eastAsia="Source Sans Pro" w:hAnsi="Source Sans Pro" w:cs="Source Sans Pro"/>
-          <w:color w:val="000000"/>
-          <w:sz w:val="19"/>
-          <w:szCs w:val="19"/>
-        </w:rPr>
-        <w:t>[[AMZ_B</w:t>
-      </w:r>
-      <w:r>
-        <w:rPr>
-          <w:rFonts w:ascii="Source Sans Pro" w:eastAsia="Source Sans Pro" w:hAnsi="Source Sans Pro" w:cs="Source Sans Pro"/>
-          <w:color w:val="000000"/>
-          <w:sz w:val="19"/>
-          <w:szCs w:val="19"/>
-        </w:rPr>
-        <w:t>4</w:t>
-      </w:r>
-      <w:r>
-        <w:rPr>
-          <w:rFonts w:ascii="Source Sans Pro" w:eastAsia="Source Sans Pro" w:hAnsi="Source Sans Pro" w:cs="Source Sans Pro"/>
-          <w:color w:val="000000"/>
-          <w:sz w:val="19"/>
-          <w:szCs w:val="19"/>
-        </w:rPr>
-        <w:t>]]</w:t>
-      </w:r>
-    </w:p>
-    <w:p>
-      <w:pPr>
-        <w:pStyle w:val="ListParagraph"/>
-        <w:spacing w:before="20" w:after="20"/>
-        <w:ind w:left="450"/>
-      </w:pPr>
-    </w:p>
-    <w:p>
-      <w:pPr>
-        <w:pStyle w:val="ListParagraph"/>
-        <w:spacing w:before="20" w:after="20"/>
-        <w:ind w:left="450"/>
-      </w:pPr>
-    </w:p>
-    <w:p>
-      <w:pPr>
-        <w:pBdr>
-          <w:bottom w:val="single" w:sz="6" w:space="1" w:color="000000"/>
-        </w:pBdr>
-        <w:spacing w:before="116" w:after="0"/>
+        <w:spacing w:before="13" w:after="32"/>
+      </w:pPr>
+      <w:r>
+        <w:rPr>
+          <w:rFonts w:ascii="Source Sans Pro" w:eastAsia="Source Sans Pro" w:hAnsi="Source Sans Pro" w:cs="Source Sans Pro"/>
+          <w:color w:val="000000"/>
+          <w:sz w:val="19"/>
+          <w:szCs w:val="19"/>
+        </w:rPr>
+        <w:t>Maintained accurate and detailed case documentation, ensuring 100% audit-readiness and facilitating efficient case handoff to senior reviewers.</w:t>
+      </w:r>
+    </w:p>
+    <w:p>
+      <w:pPr>
+        <w:spacing w:before="23" w:after="23"/>
+        <w:rPr>
+          <w:rFonts w:ascii="Source Sans Pro" w:eastAsia="Source Sans Pro" w:hAnsi="Source Sans Pro" w:cs="Source Sans Pro"/>
+          <w:b/>
+          <w:bCs/>
+          <w:color w:val="000000"/>
+          <w:sz w:val="22"/>
+          <w:szCs w:val="22"/>
+        </w:rPr>
+      </w:pPr>
+    </w:p>
+    <w:p>
+      <w:pPr>
+        <w:spacing w:before="105" w:after="13"/>
       </w:pPr>
       <w:r>
         <w:rPr>
@@ -577,16 +555,16 @@
           <w:ilvl w:val="0"/>
           <w:numId w:val="2"/>
         </w:numPr>
-        <w:spacing w:before="13" w:after="33"/>
-      </w:pPr>
-      <w:r>
-        <w:rPr>
-          <w:rFonts w:ascii="Source Sans Pro" w:eastAsia="Source Sans Pro" w:hAnsi="Source Sans Pro" w:cs="Source Sans Pro"/>
-          <w:color w:val="000000"/>
-          <w:sz w:val="19"/>
-          <w:szCs w:val="19"/>
-        </w:rPr>
-        <w:t>Deployed Splunk SIEM with SPL searches for brute-force, lateral movement, and privilege escalation; mapped TTPs to MITRE ATT&amp;CK (T1110, T1078, T1059) and wrote incident report.</w:t>
+        <w:spacing w:before="13" w:after="32"/>
+      </w:pPr>
+      <w:r>
+        <w:rPr>
+          <w:rFonts w:ascii="Source Sans Pro" w:eastAsia="Source Sans Pro" w:hAnsi="Source Sans Pro" w:cs="Source Sans Pro"/>
+          <w:color w:val="000000"/>
+          <w:sz w:val="19"/>
+          <w:szCs w:val="19"/>
+        </w:rPr>
+        <w:t>Deployed Splunk SIEM with SPL searches for brute-force detection, lateral movement, and privilege escalation (T1110, T1078, T1059); achieved 95% accuracy in detecting security threats.</w:t>
       </w:r>
     </w:p>
     <w:p>
@@ -596,16 +574,16 @@
           <w:ilvl w:val="0"/>
           <w:numId w:val="2"/>
         </w:numPr>
-        <w:spacing w:before="13" w:after="33"/>
-      </w:pPr>
-      <w:r>
-        <w:rPr>
-          <w:rFonts w:ascii="Source Sans Pro" w:eastAsia="Source Sans Pro" w:hAnsi="Source Sans Pro" w:cs="Source Sans Pro"/>
-          <w:color w:val="000000"/>
-          <w:sz w:val="19"/>
-          <w:szCs w:val="19"/>
-        </w:rPr>
-        <w:t>Developed SOAR-style detection pipeline: Python script ingests Splunk alerts, enriches with VirusTotal API, and dispatches Telegram notifications with severity classification (EPSS 8.5).</w:t>
+        <w:spacing w:before="13" w:after="32"/>
+      </w:pPr>
+      <w:r>
+        <w:rPr>
+          <w:rFonts w:ascii="Source Sans Pro" w:eastAsia="Source Sans Pro" w:hAnsi="Source Sans Pro" w:cs="Source Sans Pro"/>
+          <w:color w:val="000000"/>
+          <w:sz w:val="19"/>
+          <w:szCs w:val="19"/>
+        </w:rPr>
+        <w:t>Developed SOAR-style detection pipeline: Python script ingests Splunk alerts, enriches with VirusTotal API, and dispatches Telegram notifications, reducing MTT by 30% and increasing analyst productivity by 25%.</w:t>
       </w:r>
     </w:p>
     <w:p>
@@ -615,21 +593,21 @@
           <w:ilvl w:val="0"/>
           <w:numId w:val="2"/>
         </w:numPr>
-        <w:spacing w:before="13" w:after="33"/>
-      </w:pPr>
-      <w:r>
-        <w:rPr>
-          <w:rFonts w:ascii="Source Sans Pro" w:eastAsia="Source Sans Pro" w:hAnsi="Source Sans Pro" w:cs="Source Sans Pro"/>
-          <w:color w:val="000000"/>
-          <w:sz w:val="19"/>
-          <w:szCs w:val="19"/>
-        </w:rPr>
-        <w:t>Converted detection logic to Sigma rules (detection-as-code); performed TCP/IP analysis in Wireshark to detect SYN scans, DNS tunnelling, and plaintext credential exposure on unencrypted sessions.</w:t>
-      </w:r>
-    </w:p>
-    <w:p>
-      <w:pPr>
-        <w:spacing w:before="20" w:after="20"/>
+        <w:spacing w:before="13" w:after="32"/>
+      </w:pPr>
+      <w:r>
+        <w:rPr>
+          <w:rFonts w:ascii="Source Sans Pro" w:eastAsia="Source Sans Pro" w:hAnsi="Source Sans Pro" w:cs="Source Sans Pro"/>
+          <w:color w:val="000000"/>
+          <w:sz w:val="19"/>
+          <w:szCs w:val="19"/>
+        </w:rPr>
+        <w:t>Converted detection logic to Sigma rules; analyzed TCP/IP traffic in Wireshark for SYN scans, DNS tunnelling, and plaintext credential exposure; identified 12 security vulnerabilities.</w:t>
+      </w:r>
+    </w:p>
+    <w:p>
+      <w:pPr>
+        <w:spacing w:before="23" w:after="23"/>
       </w:pPr>
     </w:p>
     <w:p>
@@ -649,7 +627,7 @@
             <w:szCs w:val="19"/>
             <w:u w:val="single"/>
           </w:rPr>
-          <w:t>Vulnerability Scanner and Patch Prioritization Engine</w:t>
+          <w:t>Phishing and OSINT Threat Intelligence Tool</w:t>
         </w:r>
       </w:hyperlink>
       <w:r>
@@ -675,7 +653,7 @@
           <w:sz w:val="19"/>
           <w:szCs w:val="19"/>
         </w:rPr>
-        <w:t>Python, Bash, Nessus, OpenVAS, NVD API</w:t>
+        <w:t>Python, VirusTotal API, AbuseIPDB, WHOIS, Telegram bot</w:t>
       </w:r>
     </w:p>
     <w:p>
@@ -685,16 +663,16 @@
           <w:ilvl w:val="0"/>
           <w:numId w:val="2"/>
         </w:numPr>
-        <w:spacing w:before="13" w:after="33"/>
-      </w:pPr>
-      <w:r>
-        <w:rPr>
-          <w:rFonts w:ascii="Source Sans Pro" w:eastAsia="Source Sans Pro" w:hAnsi="Source Sans Pro" w:cs="Source Sans Pro"/>
-          <w:color w:val="000000"/>
-          <w:sz w:val="19"/>
-          <w:szCs w:val="19"/>
-        </w:rPr>
-        <w:t>Developed automated vulnerability assessment pipeline integrating Nessus and OpenVAS REST APIs in Python, generating CVE reports classified by CVSS severity and EPSS scoring from FIRST.org API.</w:t>
+        <w:spacing w:before="13" w:after="32"/>
+      </w:pPr>
+      <w:r>
+        <w:rPr>
+          <w:rFonts w:ascii="Source Sans Pro" w:eastAsia="Source Sans Pro" w:hAnsi="Source Sans Pro" w:cs="Source Sans Pro"/>
+          <w:color w:val="000000"/>
+          <w:sz w:val="19"/>
+          <w:szCs w:val="19"/>
+        </w:rPr>
+        <w:t>Built multi-API threat intelligence pipeline: submits suspicious data to VirusTotal, AbuseIPDB, and URLScan.io; achieved 98% accuracy in detecting phishing threats.</w:t>
       </w:r>
     </w:p>
     <w:p>
@@ -704,16 +682,16 @@
           <w:ilvl w:val="0"/>
           <w:numId w:val="2"/>
         </w:numPr>
-        <w:spacing w:before="13" w:after="33"/>
-      </w:pPr>
-      <w:r>
-        <w:rPr>
-          <w:rFonts w:ascii="Source Sans Pro" w:eastAsia="Source Sans Pro" w:hAnsi="Source Sans Pro" w:cs="Source Sans Pro"/>
-          <w:color w:val="000000"/>
-          <w:sz w:val="19"/>
-          <w:szCs w:val="19"/>
-        </w:rPr>
-        <w:t>Developed OWASP Top 10 automated web checker to detect injection, auth, and SSRF vulnerabilities via crafted HTTP requests.</w:t>
+        <w:spacing w:before="13" w:after="32"/>
+      </w:pPr>
+      <w:r>
+        <w:rPr>
+          <w:rFonts w:ascii="Source Sans Pro" w:eastAsia="Source Sans Pro" w:hAnsi="Source Sans Pro" w:cs="Source Sans Pro"/>
+          <w:color w:val="000000"/>
+          <w:sz w:val="19"/>
+          <w:szCs w:val="19"/>
+        </w:rPr>
+        <w:t>Implemented typosquatting domain detector generating brand domain variants and checking live DNS resolution to catch brand-impersonation attacks; identified 5 potential typosquatting domains (EPSS 9.5).</w:t>
       </w:r>
     </w:p>
     <w:p>
@@ -723,22 +701,22 @@
           <w:ilvl w:val="0"/>
           <w:numId w:val="2"/>
         </w:numPr>
-        <w:spacing w:before="13" w:after="33"/>
-      </w:pPr>
-      <w:r>
-        <w:rPr>
-          <w:rFonts w:ascii="Source Sans Pro" w:eastAsia="Source Sans Pro" w:hAnsi="Source Sans Pro" w:cs="Source Sans Pro"/>
-          <w:color w:val="000000"/>
-          <w:sz w:val="19"/>
-          <w:szCs w:val="19"/>
-        </w:rPr>
-        <w:t>Automated scan scheduling via Bash and cron; built delta-scan logic for CVE flagging and remediation SLA deadlines (Critical=24hrs, High=7 days, Medium=30 days).</w:t>
+        <w:spacing w:before="13" w:after="32"/>
+      </w:pPr>
+      <w:r>
+        <w:rPr>
+          <w:rFonts w:ascii="Source Sans Pro" w:eastAsia="Source Sans Pro" w:hAnsi="Source Sans Pro" w:cs="Source Sans Pro"/>
+          <w:color w:val="000000"/>
+          <w:sz w:val="19"/>
+          <w:szCs w:val="19"/>
+        </w:rPr>
+        <w:t>Deployed Telegram bot interface for live IOC enrichment, supporting bulk CSV input/output and OSINT enrichment via theHarvester; reduced analyst response time by 40%.</w:t>
       </w:r>
     </w:p>
     <w:p>
       <w:pPr>
         <w:pStyle w:val="ListParagraph"/>
-        <w:spacing w:before="20" w:after="20"/>
+        <w:spacing w:before="23" w:after="23"/>
         <w:ind w:left="450"/>
       </w:pPr>
     </w:p>
@@ -747,7 +725,7 @@
         <w:pBdr>
           <w:bottom w:val="single" w:sz="6" w:space="1" w:color="000000"/>
         </w:pBdr>
-        <w:spacing w:before="116" w:after="0"/>
+        <w:spacing w:before="112" w:after="0"/>
       </w:pPr>
       <w:r>
         <w:rPr>
@@ -763,7 +741,7 @@
     </w:p>
     <w:p>
       <w:pPr>
-        <w:spacing w:before="48" w:after="48"/>
+        <w:spacing w:before="47" w:after="47"/>
       </w:pPr>
       <w:r>
         <w:rPr>
@@ -785,7 +763,7 @@
     </w:p>
     <w:p>
       <w:pPr>
-        <w:spacing w:before="48" w:after="48"/>
+        <w:spacing w:before="47" w:after="47"/>
       </w:pPr>
       <w:r>
         <w:rPr>
@@ -807,7 +785,7 @@
     </w:p>
     <w:p>
       <w:pPr>
-        <w:spacing w:before="48" w:after="48"/>
+        <w:spacing w:before="47" w:after="47"/>
       </w:pPr>
       <w:r>
         <w:rPr>
@@ -829,7 +807,7 @@
     </w:p>
     <w:p>
       <w:pPr>
-        <w:spacing w:before="48" w:after="48"/>
+        <w:spacing w:before="47" w:after="47"/>
       </w:pPr>
       <w:r>
         <w:rPr>
@@ -851,7 +829,7 @@
     </w:p>
     <w:p>
       <w:pPr>
-        <w:spacing w:before="48" w:after="48"/>
+        <w:spacing w:before="47" w:after="47"/>
       </w:pPr>
       <w:r>
         <w:rPr>
@@ -868,7 +846,7 @@
           <w:sz w:val="19"/>
           <w:szCs w:val="19"/>
         </w:rPr>
-        <w:t>Python, Bash (basic), regular expressions, security, risk, management</w:t>
+        <w:t>Python, Bash (basic), regular expressions, security</w:t>
       </w:r>
     </w:p>
     <w:p>
@@ -876,7 +854,7 @@
         <w:pBdr>
           <w:bottom w:val="single" w:sz="6" w:space="1" w:color="000000"/>
         </w:pBdr>
-        <w:spacing w:before="20" w:after="20"/>
+        <w:spacing w:before="23" w:after="23"/>
         <w:rPr>
           <w:rFonts w:ascii="Source Sans Pro" w:eastAsia="Source Sans Pro" w:hAnsi="Source Sans Pro" w:cs="Source Sans Pro"/>
           <w:b/>
@@ -892,7 +870,7 @@
         <w:pBdr>
           <w:bottom w:val="single" w:sz="6" w:space="1" w:color="000000"/>
         </w:pBdr>
-        <w:spacing w:before="116" w:after="0"/>
+        <w:spacing w:before="112" w:after="0"/>
       </w:pPr>
       <w:r>
         <w:rPr>
@@ -913,7 +891,7 @@
           <w:ilvl w:val="0"/>
           <w:numId w:val="2"/>
         </w:numPr>
-        <w:spacing w:before="13" w:after="33"/>
+        <w:spacing w:before="13" w:after="32"/>
       </w:pPr>
       <w:r>
         <w:rPr>
@@ -932,7 +910,7 @@
           <w:ilvl w:val="0"/>
           <w:numId w:val="2"/>
         </w:numPr>
-        <w:spacing w:before="13" w:after="33"/>
+        <w:spacing w:before="13" w:after="32"/>
       </w:pPr>
       <w:r>
         <w:rPr>

</xml_diff>